<commit_message>
bug fixes and added some demo data
</commit_message>
<xml_diff>
--- a/docsCeylonTourMateLK/proposal/CeylonTourMate.LK.docx
+++ b/docsCeylonTourMateLK/proposal/CeylonTourMate.LK.docx
@@ -280,9 +280,8 @@
           <w:sz w:val="56"/>
           <w:szCs w:val="56"/>
         </w:rPr>
-        <w:t xml:space="preserve">National Institute </w:t>
-      </w:r>
-      <w:proofErr w:type="gramStart"/>
+        <w:t>National Institute Of Business Management</w:t>
+      </w:r>
       <w:r>
         <w:rPr>
           <w:rFonts w:ascii="Bahnschrift SemiBold" w:hAnsi="Bahnschrift SemiBold"/>
@@ -291,27 +290,6 @@
           <w:sz w:val="56"/>
           <w:szCs w:val="56"/>
         </w:rPr>
-        <w:t>Of</w:t>
-      </w:r>
-      <w:proofErr w:type="gramEnd"/>
-      <w:r>
-        <w:rPr>
-          <w:rFonts w:ascii="Bahnschrift SemiBold" w:hAnsi="Bahnschrift SemiBold"/>
-          <w:b/>
-          <w:bCs/>
-          <w:sz w:val="56"/>
-          <w:szCs w:val="56"/>
-        </w:rPr>
-        <w:t xml:space="preserve"> Business Management</w:t>
-      </w:r>
-      <w:r>
-        <w:rPr>
-          <w:rFonts w:ascii="Bahnschrift SemiBold" w:hAnsi="Bahnschrift SemiBold"/>
-          <w:b/>
-          <w:bCs/>
-          <w:sz w:val="56"/>
-          <w:szCs w:val="56"/>
-        </w:rPr>
         <w:br/>
       </w:r>
       <w:r>
@@ -322,29 +300,7 @@
           <w:sz w:val="52"/>
           <w:szCs w:val="52"/>
         </w:rPr>
-        <w:t xml:space="preserve">Diploma </w:t>
-      </w:r>
-      <w:proofErr w:type="gramStart"/>
-      <w:r>
-        <w:rPr>
-          <w:rFonts w:ascii="Bahnschrift SemiBold" w:hAnsi="Bahnschrift SemiBold"/>
-          <w:b/>
-          <w:bCs/>
-          <w:sz w:val="52"/>
-          <w:szCs w:val="52"/>
-        </w:rPr>
-        <w:t>In</w:t>
-      </w:r>
-      <w:proofErr w:type="gramEnd"/>
-      <w:r>
-        <w:rPr>
-          <w:rFonts w:ascii="Bahnschrift SemiBold" w:hAnsi="Bahnschrift SemiBold"/>
-          <w:b/>
-          <w:bCs/>
-          <w:sz w:val="52"/>
-          <w:szCs w:val="52"/>
-        </w:rPr>
-        <w:t xml:space="preserve"> Software Engineering</w:t>
+        <w:t>Diploma In Software Engineering</w:t>
       </w:r>
     </w:p>
     <w:p>
@@ -2012,16 +1968,32 @@
         <w:rPr>
           <w:rFonts w:ascii="Times New Roman" w:hAnsi="Times New Roman" w:cs="Times New Roman"/>
         </w:rPr>
-        <w:t xml:space="preserve">growth, </w:t>
-      </w:r>
-      <w:proofErr w:type="gramStart"/>
-      <w:r>
-        <w:rPr>
-          <w:rFonts w:ascii="Times New Roman" w:hAnsi="Times New Roman" w:cs="Times New Roman"/>
-        </w:rPr>
-        <w:t>specially</w:t>
-      </w:r>
-      <w:proofErr w:type="gramEnd"/>
+        <w:t xml:space="preserve">growth, specially </w:t>
+      </w:r>
+      <w:r>
+        <w:rPr>
+          <w:rFonts w:ascii="Times New Roman" w:hAnsi="Times New Roman" w:cs="Times New Roman"/>
+        </w:rPr>
+        <w:t xml:space="preserve">local </w:t>
+      </w:r>
+      <w:r>
+        <w:rPr>
+          <w:rFonts w:ascii="Times New Roman" w:hAnsi="Times New Roman" w:cs="Times New Roman"/>
+        </w:rPr>
+        <w:t>Sri Lankans</w:t>
+      </w:r>
+      <w:r>
+        <w:rPr>
+          <w:rFonts w:ascii="Times New Roman" w:hAnsi="Times New Roman" w:cs="Times New Roman"/>
+        </w:rPr>
+        <w:t xml:space="preserve"> provide a variety of services like </w:t>
+      </w:r>
+      <w:r>
+        <w:rPr>
+          <w:rFonts w:ascii="Times New Roman" w:hAnsi="Times New Roman" w:cs="Times New Roman"/>
+        </w:rPr>
+        <w:t>accommodations, guide</w:t>
+      </w:r>
       <w:r>
         <w:rPr>
           <w:rFonts w:ascii="Times New Roman" w:hAnsi="Times New Roman" w:cs="Times New Roman"/>
@@ -2032,36 +2004,6 @@
         <w:rPr>
           <w:rFonts w:ascii="Times New Roman" w:hAnsi="Times New Roman" w:cs="Times New Roman"/>
         </w:rPr>
-        <w:t xml:space="preserve">local </w:t>
-      </w:r>
-      <w:r>
-        <w:rPr>
-          <w:rFonts w:ascii="Times New Roman" w:hAnsi="Times New Roman" w:cs="Times New Roman"/>
-        </w:rPr>
-        <w:t>Sri Lankans</w:t>
-      </w:r>
-      <w:r>
-        <w:rPr>
-          <w:rFonts w:ascii="Times New Roman" w:hAnsi="Times New Roman" w:cs="Times New Roman"/>
-        </w:rPr>
-        <w:t xml:space="preserve"> provide a variety of services like </w:t>
-      </w:r>
-      <w:r>
-        <w:rPr>
-          <w:rFonts w:ascii="Times New Roman" w:hAnsi="Times New Roman" w:cs="Times New Roman"/>
-        </w:rPr>
-        <w:t>accommodations, guide</w:t>
-      </w:r>
-      <w:r>
-        <w:rPr>
-          <w:rFonts w:ascii="Times New Roman" w:hAnsi="Times New Roman" w:cs="Times New Roman"/>
-        </w:rPr>
-        <w:t xml:space="preserve"> </w:t>
-      </w:r>
-      <w:r>
-        <w:rPr>
-          <w:rFonts w:ascii="Times New Roman" w:hAnsi="Times New Roman" w:cs="Times New Roman"/>
-        </w:rPr>
         <w:t>tours, local</w:t>
       </w:r>
       <w:r>
@@ -2217,19 +2159,11 @@
           <w:rFonts w:ascii="Times New Roman" w:hAnsi="Times New Roman" w:cs="Times New Roman"/>
         </w:rPr>
       </w:pPr>
-      <w:proofErr w:type="gramStart"/>
-      <w:r>
-        <w:rPr>
-          <w:rFonts w:ascii="Times New Roman" w:hAnsi="Times New Roman" w:cs="Times New Roman"/>
-        </w:rPr>
-        <w:t>So</w:t>
-      </w:r>
-      <w:proofErr w:type="gramEnd"/>
-      <w:r>
-        <w:rPr>
-          <w:rFonts w:ascii="Times New Roman" w:hAnsi="Times New Roman" w:cs="Times New Roman"/>
-        </w:rPr>
-        <w:t xml:space="preserve"> </w:t>
+      <w:r>
+        <w:rPr>
+          <w:rFonts w:ascii="Times New Roman" w:hAnsi="Times New Roman" w:cs="Times New Roman"/>
+        </w:rPr>
+        <w:t xml:space="preserve">So </w:t>
       </w:r>
       <w:r>
         <w:rPr>
@@ -2241,21 +2175,7 @@
         <w:rPr>
           <w:rFonts w:ascii="Times New Roman" w:hAnsi="Times New Roman" w:cs="Times New Roman"/>
         </w:rPr>
-        <w:t xml:space="preserve"> planning to make a </w:t>
-      </w:r>
-      <w:proofErr w:type="gramStart"/>
-      <w:r>
-        <w:rPr>
-          <w:rFonts w:ascii="Times New Roman" w:hAnsi="Times New Roman" w:cs="Times New Roman"/>
-        </w:rPr>
-        <w:t>web based</w:t>
-      </w:r>
-      <w:proofErr w:type="gramEnd"/>
-      <w:r>
-        <w:rPr>
-          <w:rFonts w:ascii="Times New Roman" w:hAnsi="Times New Roman" w:cs="Times New Roman"/>
-        </w:rPr>
-        <w:t xml:space="preserve"> solution for </w:t>
+        <w:t xml:space="preserve"> planning to make a web based solution for </w:t>
       </w:r>
       <w:r>
         <w:rPr>
@@ -2379,14 +2299,7 @@
         <w:rPr>
           <w:rFonts w:ascii="Times New Roman" w:hAnsi="Times New Roman" w:cs="Times New Roman"/>
         </w:rPr>
-        <w:t xml:space="preserve">issue </w:t>
-      </w:r>
-      <w:proofErr w:type="gramStart"/>
-      <w:r>
-        <w:rPr>
-          <w:rFonts w:ascii="Times New Roman" w:hAnsi="Times New Roman" w:cs="Times New Roman"/>
-        </w:rPr>
-        <w:t>i</w:t>
+        <w:t>issue i</w:t>
       </w:r>
       <w:r>
         <w:rPr>
@@ -2394,7 +2307,6 @@
         </w:rPr>
         <w:t>s</w:t>
       </w:r>
-      <w:proofErr w:type="gramEnd"/>
       <w:r>
         <w:rPr>
           <w:rFonts w:ascii="Times New Roman" w:hAnsi="Times New Roman" w:cs="Times New Roman"/>
@@ -2445,21 +2357,7 @@
         <w:rPr>
           <w:rFonts w:ascii="Times New Roman" w:hAnsi="Times New Roman" w:cs="Times New Roman"/>
         </w:rPr>
-        <w:t xml:space="preserve">which will be a bad experience for tourists specially </w:t>
-      </w:r>
-      <w:proofErr w:type="gramStart"/>
-      <w:r>
-        <w:rPr>
-          <w:rFonts w:ascii="Times New Roman" w:hAnsi="Times New Roman" w:cs="Times New Roman"/>
-        </w:rPr>
-        <w:t>first time</w:t>
-      </w:r>
-      <w:proofErr w:type="gramEnd"/>
-      <w:r>
-        <w:rPr>
-          <w:rFonts w:ascii="Times New Roman" w:hAnsi="Times New Roman" w:cs="Times New Roman"/>
-        </w:rPr>
-        <w:t xml:space="preserve"> visito</w:t>
+        <w:t>which will be a bad experience for tourists specially first time visito</w:t>
       </w:r>
       <w:r>
         <w:rPr>
@@ -2599,35 +2497,7 @@
         <w:rPr>
           <w:rFonts w:ascii="Times New Roman" w:hAnsi="Times New Roman" w:cs="Times New Roman"/>
         </w:rPr>
-        <w:t xml:space="preserve">as well as not every tourist understands Sinhala or </w:t>
-      </w:r>
-      <w:proofErr w:type="gramStart"/>
-      <w:r>
-        <w:rPr>
-          <w:rFonts w:ascii="Times New Roman" w:hAnsi="Times New Roman" w:cs="Times New Roman"/>
-        </w:rPr>
-        <w:t>Tamil</w:t>
-      </w:r>
-      <w:proofErr w:type="gramEnd"/>
-      <w:r>
-        <w:rPr>
-          <w:rFonts w:ascii="Times New Roman" w:hAnsi="Times New Roman" w:cs="Times New Roman"/>
-        </w:rPr>
-        <w:t xml:space="preserve"> so communication becomes hard when it comes to book a </w:t>
-      </w:r>
-      <w:proofErr w:type="gramStart"/>
-      <w:r>
-        <w:rPr>
-          <w:rFonts w:ascii="Times New Roman" w:hAnsi="Times New Roman" w:cs="Times New Roman"/>
-        </w:rPr>
-        <w:t>services</w:t>
-      </w:r>
-      <w:proofErr w:type="gramEnd"/>
-      <w:r>
-        <w:rPr>
-          <w:rFonts w:ascii="Times New Roman" w:hAnsi="Times New Roman" w:cs="Times New Roman"/>
-        </w:rPr>
-        <w:t>.</w:t>
+        <w:t>as well as not every tourist understands Sinhala or Tamil so communication becomes hard when it comes to book a services.</w:t>
       </w:r>
     </w:p>
     <w:p>
@@ -2705,21 +2575,7 @@
         <w:rPr>
           <w:rFonts w:ascii="Times New Roman" w:hAnsi="Times New Roman" w:cs="Times New Roman"/>
         </w:rPr>
-        <w:t xml:space="preserve"> can also be challenging for tourists and people who </w:t>
-      </w:r>
-      <w:proofErr w:type="gramStart"/>
-      <w:r>
-        <w:rPr>
-          <w:rFonts w:ascii="Times New Roman" w:hAnsi="Times New Roman" w:cs="Times New Roman"/>
-        </w:rPr>
-        <w:t>trying</w:t>
-      </w:r>
-      <w:proofErr w:type="gramEnd"/>
-      <w:r>
-        <w:rPr>
-          <w:rFonts w:ascii="Times New Roman" w:hAnsi="Times New Roman" w:cs="Times New Roman"/>
-        </w:rPr>
-        <w:t xml:space="preserve"> to provide these services.</w:t>
+        <w:t xml:space="preserve"> can also be challenging for tourists and people who trying to provide these services.</w:t>
       </w:r>
     </w:p>
     <w:p>
@@ -2773,21 +2629,7 @@
         <w:rPr>
           <w:rFonts w:ascii="Times New Roman" w:hAnsi="Times New Roman" w:cs="Times New Roman"/>
         </w:rPr>
-        <w:t xml:space="preserve"> that provides all services in one place to </w:t>
-      </w:r>
-      <w:proofErr w:type="gramStart"/>
-      <w:r>
-        <w:rPr>
-          <w:rFonts w:ascii="Times New Roman" w:hAnsi="Times New Roman" w:cs="Times New Roman"/>
-        </w:rPr>
-        <w:t>tourists</w:t>
-      </w:r>
-      <w:proofErr w:type="gramEnd"/>
-      <w:r>
-        <w:rPr>
-          <w:rFonts w:ascii="Times New Roman" w:hAnsi="Times New Roman" w:cs="Times New Roman"/>
-        </w:rPr>
-        <w:t xml:space="preserve"> and it is specifically designed for </w:t>
+        <w:t xml:space="preserve"> that provides all services in one place to tourists and it is specifically designed for </w:t>
       </w:r>
       <w:r>
         <w:rPr>
@@ -3267,35 +3109,7 @@
         <w:rPr>
           <w:rFonts w:ascii="Times New Roman" w:hAnsi="Times New Roman" w:cs="Times New Roman"/>
         </w:rPr>
-        <w:t xml:space="preserve">They can register on </w:t>
-      </w:r>
-      <w:proofErr w:type="gramStart"/>
-      <w:r>
-        <w:rPr>
-          <w:rFonts w:ascii="Times New Roman" w:hAnsi="Times New Roman" w:cs="Times New Roman"/>
-        </w:rPr>
-        <w:t>my</w:t>
-      </w:r>
-      <w:proofErr w:type="gramEnd"/>
-      <w:r>
-        <w:rPr>
-          <w:rFonts w:ascii="Times New Roman" w:hAnsi="Times New Roman" w:cs="Times New Roman"/>
-        </w:rPr>
-        <w:t xml:space="preserve"> </w:t>
-      </w:r>
-      <w:proofErr w:type="gramStart"/>
-      <w:r>
-        <w:rPr>
-          <w:rFonts w:ascii="Times New Roman" w:hAnsi="Times New Roman" w:cs="Times New Roman"/>
-        </w:rPr>
-        <w:t>web</w:t>
-      </w:r>
-      <w:proofErr w:type="gramEnd"/>
-      <w:r>
-        <w:rPr>
-          <w:rFonts w:ascii="Times New Roman" w:hAnsi="Times New Roman" w:cs="Times New Roman"/>
-        </w:rPr>
-        <w:t>,</w:t>
+        <w:t>They can register on my web,</w:t>
       </w:r>
       <w:r>
         <w:rPr>
@@ -3357,21 +3171,7 @@
         <w:rPr>
           <w:rFonts w:ascii="Times New Roman" w:hAnsi="Times New Roman" w:cs="Times New Roman"/>
         </w:rPr>
-        <w:t xml:space="preserve">Admins can review local </w:t>
-      </w:r>
-      <w:proofErr w:type="gramStart"/>
-      <w:r>
-        <w:rPr>
-          <w:rFonts w:ascii="Times New Roman" w:hAnsi="Times New Roman" w:cs="Times New Roman"/>
-        </w:rPr>
-        <w:t>partners</w:t>
-      </w:r>
-      <w:proofErr w:type="gramEnd"/>
-      <w:r>
-        <w:rPr>
-          <w:rFonts w:ascii="Times New Roman" w:hAnsi="Times New Roman" w:cs="Times New Roman"/>
-        </w:rPr>
-        <w:t xml:space="preserve"> posts,</w:t>
+        <w:t>Admins can review local partners posts,</w:t>
       </w:r>
       <w:r>
         <w:rPr>
@@ -4576,21 +4376,7 @@
               <w:rPr>
                 <w:rFonts w:ascii="Times New Roman" w:hAnsi="Times New Roman" w:cs="Times New Roman"/>
               </w:rPr>
-              <w:t xml:space="preserve">Tour </w:t>
-            </w:r>
-            <w:proofErr w:type="gramStart"/>
-            <w:r>
-              <w:rPr>
-                <w:rFonts w:ascii="Times New Roman" w:hAnsi="Times New Roman" w:cs="Times New Roman"/>
-              </w:rPr>
-              <w:t>guide</w:t>
-            </w:r>
-            <w:proofErr w:type="gramEnd"/>
-            <w:r>
-              <w:rPr>
-                <w:rFonts w:ascii="Times New Roman" w:hAnsi="Times New Roman" w:cs="Times New Roman"/>
-              </w:rPr>
-              <w:t xml:space="preserve"> </w:t>
+              <w:t xml:space="preserve">Tour guide </w:t>
             </w:r>
             <w:r>
               <w:rPr>
@@ -4749,21 +4535,7 @@
               <w:rPr>
                 <w:rFonts w:ascii="Times New Roman" w:hAnsi="Times New Roman" w:cs="Times New Roman"/>
               </w:rPr>
-              <w:t xml:space="preserve">Tour </w:t>
-            </w:r>
-            <w:proofErr w:type="gramStart"/>
-            <w:r>
-              <w:rPr>
-                <w:rFonts w:ascii="Times New Roman" w:hAnsi="Times New Roman" w:cs="Times New Roman"/>
-              </w:rPr>
-              <w:t>guide</w:t>
-            </w:r>
-            <w:proofErr w:type="gramEnd"/>
-            <w:r>
-              <w:rPr>
-                <w:rFonts w:ascii="Times New Roman" w:hAnsi="Times New Roman" w:cs="Times New Roman"/>
-              </w:rPr>
-              <w:t xml:space="preserve"> </w:t>
+              <w:t xml:space="preserve">Tour guide </w:t>
             </w:r>
             <w:r>
               <w:rPr>
@@ -4982,21 +4754,7 @@
               <w:rPr>
                 <w:rFonts w:ascii="Times New Roman" w:hAnsi="Times New Roman" w:cs="Times New Roman"/>
               </w:rPr>
-              <w:t xml:space="preserve">Tour </w:t>
-            </w:r>
-            <w:proofErr w:type="gramStart"/>
-            <w:r>
-              <w:rPr>
-                <w:rFonts w:ascii="Times New Roman" w:hAnsi="Times New Roman" w:cs="Times New Roman"/>
-              </w:rPr>
-              <w:t>guide</w:t>
-            </w:r>
-            <w:proofErr w:type="gramEnd"/>
-            <w:r>
-              <w:rPr>
-                <w:rFonts w:ascii="Times New Roman" w:hAnsi="Times New Roman" w:cs="Times New Roman"/>
-              </w:rPr>
-              <w:t xml:space="preserve"> shall be able to set their availability</w:t>
+              <w:t>Tour guide shall be able to set their availability</w:t>
             </w:r>
           </w:p>
         </w:tc>
@@ -5045,35 +4803,7 @@
               <w:rPr>
                 <w:rFonts w:ascii="Times New Roman" w:hAnsi="Times New Roman" w:cs="Times New Roman"/>
               </w:rPr>
-              <w:t xml:space="preserve">Tour </w:t>
-            </w:r>
-            <w:proofErr w:type="gramStart"/>
-            <w:r>
-              <w:rPr>
-                <w:rFonts w:ascii="Times New Roman" w:hAnsi="Times New Roman" w:cs="Times New Roman"/>
-              </w:rPr>
-              <w:t>guide</w:t>
-            </w:r>
-            <w:proofErr w:type="gramEnd"/>
-            <w:r>
-              <w:rPr>
-                <w:rFonts w:ascii="Times New Roman" w:hAnsi="Times New Roman" w:cs="Times New Roman"/>
-              </w:rPr>
-              <w:t xml:space="preserve"> shall be able to view their monthly </w:t>
-            </w:r>
-            <w:proofErr w:type="gramStart"/>
-            <w:r>
-              <w:rPr>
-                <w:rFonts w:ascii="Times New Roman" w:hAnsi="Times New Roman" w:cs="Times New Roman"/>
-              </w:rPr>
-              <w:t>earning</w:t>
-            </w:r>
-            <w:proofErr w:type="gramEnd"/>
-            <w:r>
-              <w:rPr>
-                <w:rFonts w:ascii="Times New Roman" w:hAnsi="Times New Roman" w:cs="Times New Roman"/>
-              </w:rPr>
-              <w:t xml:space="preserve"> and commissions</w:t>
+              <w:t>Tour guide shall be able to view their monthly earning and commissions</w:t>
             </w:r>
           </w:p>
         </w:tc>
@@ -5195,21 +4925,7 @@
               <w:rPr>
                 <w:rFonts w:ascii="Times New Roman" w:hAnsi="Times New Roman" w:cs="Times New Roman"/>
               </w:rPr>
-              <w:t xml:space="preserve">Tour </w:t>
-            </w:r>
-            <w:proofErr w:type="gramStart"/>
-            <w:r>
-              <w:rPr>
-                <w:rFonts w:ascii="Times New Roman" w:hAnsi="Times New Roman" w:cs="Times New Roman"/>
-              </w:rPr>
-              <w:t>guide</w:t>
-            </w:r>
-            <w:proofErr w:type="gramEnd"/>
-            <w:r>
-              <w:rPr>
-                <w:rFonts w:ascii="Times New Roman" w:hAnsi="Times New Roman" w:cs="Times New Roman"/>
-              </w:rPr>
-              <w:t xml:space="preserve"> </w:t>
+              <w:t xml:space="preserve">Tour guide </w:t>
             </w:r>
             <w:r>
               <w:rPr>
@@ -5350,16 +5066,8 @@
               <w:rPr>
                 <w:rFonts w:ascii="Times New Roman" w:hAnsi="Times New Roman" w:cs="Times New Roman"/>
               </w:rPr>
-              <w:t xml:space="preserve">Shop </w:t>
-            </w:r>
-            <w:proofErr w:type="gramStart"/>
-            <w:r>
-              <w:rPr>
-                <w:rFonts w:ascii="Times New Roman" w:hAnsi="Times New Roman" w:cs="Times New Roman"/>
-              </w:rPr>
-              <w:t>owner</w:t>
-            </w:r>
-            <w:proofErr w:type="gramEnd"/>
+              <w:t>Shop owner</w:t>
+            </w:r>
             <w:r>
               <w:rPr>
                 <w:rFonts w:ascii="Times New Roman" w:hAnsi="Times New Roman" w:cs="Times New Roman"/>
@@ -5407,16 +5115,8 @@
               <w:rPr>
                 <w:rFonts w:ascii="Times New Roman" w:hAnsi="Times New Roman" w:cs="Times New Roman"/>
               </w:rPr>
-              <w:t xml:space="preserve">Shop </w:t>
-            </w:r>
-            <w:proofErr w:type="gramStart"/>
-            <w:r>
-              <w:rPr>
-                <w:rFonts w:ascii="Times New Roman" w:hAnsi="Times New Roman" w:cs="Times New Roman"/>
-              </w:rPr>
-              <w:t>owner</w:t>
-            </w:r>
-            <w:proofErr w:type="gramEnd"/>
+              <w:t>Shop owner</w:t>
+            </w:r>
             <w:r>
               <w:rPr>
                 <w:rFonts w:ascii="Times New Roman" w:hAnsi="Times New Roman" w:cs="Times New Roman"/>
@@ -5458,21 +5158,7 @@
               <w:rPr>
                 <w:rFonts w:ascii="Times New Roman" w:hAnsi="Times New Roman" w:cs="Times New Roman"/>
               </w:rPr>
-              <w:t xml:space="preserve">Shop </w:t>
-            </w:r>
-            <w:proofErr w:type="gramStart"/>
-            <w:r>
-              <w:rPr>
-                <w:rFonts w:ascii="Times New Roman" w:hAnsi="Times New Roman" w:cs="Times New Roman"/>
-              </w:rPr>
-              <w:t>owner</w:t>
-            </w:r>
-            <w:proofErr w:type="gramEnd"/>
-            <w:r>
-              <w:rPr>
-                <w:rFonts w:ascii="Times New Roman" w:hAnsi="Times New Roman" w:cs="Times New Roman"/>
-              </w:rPr>
-              <w:t xml:space="preserve"> shall be able to reset their password</w:t>
+              <w:t>Shop owner shall be able to reset their password</w:t>
             </w:r>
           </w:p>
         </w:tc>
@@ -5564,21 +5250,7 @@
               <w:rPr>
                 <w:rFonts w:ascii="Times New Roman" w:hAnsi="Times New Roman" w:cs="Times New Roman"/>
               </w:rPr>
-              <w:t xml:space="preserve">Shop </w:t>
-            </w:r>
-            <w:proofErr w:type="gramStart"/>
-            <w:r>
-              <w:rPr>
-                <w:rFonts w:ascii="Times New Roman" w:hAnsi="Times New Roman" w:cs="Times New Roman"/>
-              </w:rPr>
-              <w:t>owner</w:t>
-            </w:r>
-            <w:proofErr w:type="gramEnd"/>
-            <w:r>
-              <w:rPr>
-                <w:rFonts w:ascii="Times New Roman" w:hAnsi="Times New Roman" w:cs="Times New Roman"/>
-              </w:rPr>
-              <w:t xml:space="preserve"> shall be able to manage(add/update/delete) their listings</w:t>
+              <w:t>Shop owner shall be able to manage(add/update/delete) their listings</w:t>
             </w:r>
           </w:p>
         </w:tc>
@@ -5670,16 +5342,8 @@
               <w:rPr>
                 <w:rFonts w:ascii="Times New Roman" w:hAnsi="Times New Roman" w:cs="Times New Roman"/>
               </w:rPr>
-              <w:t xml:space="preserve">Shop </w:t>
-            </w:r>
-            <w:proofErr w:type="gramStart"/>
-            <w:r>
-              <w:rPr>
-                <w:rFonts w:ascii="Times New Roman" w:hAnsi="Times New Roman" w:cs="Times New Roman"/>
-              </w:rPr>
-              <w:t>owner</w:t>
-            </w:r>
-            <w:proofErr w:type="gramEnd"/>
+              <w:t>Shop owner</w:t>
+            </w:r>
             <w:r>
               <w:rPr>
                 <w:rFonts w:ascii="Times New Roman" w:hAnsi="Times New Roman" w:cs="Times New Roman"/>
@@ -5769,16 +5433,8 @@
               <w:rPr>
                 <w:rFonts w:ascii="Times New Roman" w:hAnsi="Times New Roman" w:cs="Times New Roman"/>
               </w:rPr>
-              <w:t xml:space="preserve">Shop </w:t>
-            </w:r>
-            <w:proofErr w:type="gramStart"/>
-            <w:r>
-              <w:rPr>
-                <w:rFonts w:ascii="Times New Roman" w:hAnsi="Times New Roman" w:cs="Times New Roman"/>
-              </w:rPr>
-              <w:t>owner</w:t>
-            </w:r>
-            <w:proofErr w:type="gramEnd"/>
+              <w:t>Shop owner</w:t>
+            </w:r>
             <w:r>
               <w:rPr>
                 <w:rFonts w:ascii="Times New Roman" w:hAnsi="Times New Roman" w:cs="Times New Roman"/>
@@ -5832,16 +5488,8 @@
               <w:rPr>
                 <w:rFonts w:ascii="Times New Roman" w:hAnsi="Times New Roman" w:cs="Times New Roman"/>
               </w:rPr>
-              <w:t xml:space="preserve">Shop </w:t>
-            </w:r>
-            <w:proofErr w:type="gramStart"/>
-            <w:r>
-              <w:rPr>
-                <w:rFonts w:ascii="Times New Roman" w:hAnsi="Times New Roman" w:cs="Times New Roman"/>
-              </w:rPr>
-              <w:t>owner</w:t>
-            </w:r>
-            <w:proofErr w:type="gramEnd"/>
+              <w:t>Shop owner</w:t>
+            </w:r>
             <w:r>
               <w:rPr>
                 <w:rFonts w:ascii="Times New Roman" w:hAnsi="Times New Roman" w:cs="Times New Roman"/>
@@ -5889,21 +5537,7 @@
               <w:rPr>
                 <w:rFonts w:ascii="Times New Roman" w:hAnsi="Times New Roman" w:cs="Times New Roman"/>
               </w:rPr>
-              <w:t xml:space="preserve">Shop </w:t>
-            </w:r>
-            <w:proofErr w:type="gramStart"/>
-            <w:r>
-              <w:rPr>
-                <w:rFonts w:ascii="Times New Roman" w:hAnsi="Times New Roman" w:cs="Times New Roman"/>
-              </w:rPr>
-              <w:t>owner</w:t>
-            </w:r>
-            <w:proofErr w:type="gramEnd"/>
-            <w:r>
-              <w:rPr>
-                <w:rFonts w:ascii="Times New Roman" w:hAnsi="Times New Roman" w:cs="Times New Roman"/>
-              </w:rPr>
-              <w:t xml:space="preserve"> shall be able to pay their monthly fee</w:t>
+              <w:t>Shop owner shall be able to pay their monthly fee</w:t>
             </w:r>
           </w:p>
         </w:tc>
@@ -6094,21 +5728,7 @@
               <w:rPr>
                 <w:rFonts w:ascii="Times New Roman" w:hAnsi="Times New Roman" w:cs="Times New Roman"/>
               </w:rPr>
-              <w:t xml:space="preserve">Hotel </w:t>
-            </w:r>
-            <w:proofErr w:type="gramStart"/>
-            <w:r>
-              <w:rPr>
-                <w:rFonts w:ascii="Times New Roman" w:hAnsi="Times New Roman" w:cs="Times New Roman"/>
-              </w:rPr>
-              <w:t>owner</w:t>
-            </w:r>
-            <w:proofErr w:type="gramEnd"/>
-            <w:r>
-              <w:rPr>
-                <w:rFonts w:ascii="Times New Roman" w:hAnsi="Times New Roman" w:cs="Times New Roman"/>
-              </w:rPr>
-              <w:t xml:space="preserve"> shall be able to login/logout from the system</w:t>
+              <w:t>Hotel owner shall be able to login/logout from the system</w:t>
             </w:r>
           </w:p>
         </w:tc>
@@ -6145,21 +5765,7 @@
               <w:rPr>
                 <w:rFonts w:ascii="Times New Roman" w:hAnsi="Times New Roman" w:cs="Times New Roman"/>
               </w:rPr>
-              <w:t xml:space="preserve">Hotel </w:t>
-            </w:r>
-            <w:proofErr w:type="gramStart"/>
-            <w:r>
-              <w:rPr>
-                <w:rFonts w:ascii="Times New Roman" w:hAnsi="Times New Roman" w:cs="Times New Roman"/>
-              </w:rPr>
-              <w:t>owner</w:t>
-            </w:r>
-            <w:proofErr w:type="gramEnd"/>
-            <w:r>
-              <w:rPr>
-                <w:rFonts w:ascii="Times New Roman" w:hAnsi="Times New Roman" w:cs="Times New Roman"/>
-              </w:rPr>
-              <w:t xml:space="preserve"> shall be able to reset their password</w:t>
+              <w:t>Hotel owner shall be able to reset their password</w:t>
             </w:r>
           </w:p>
         </w:tc>
@@ -6208,35 +5814,7 @@
               <w:rPr>
                 <w:rFonts w:ascii="Times New Roman" w:hAnsi="Times New Roman" w:cs="Times New Roman"/>
               </w:rPr>
-              <w:t xml:space="preserve">Hotel </w:t>
-            </w:r>
-            <w:proofErr w:type="gramStart"/>
-            <w:r>
-              <w:rPr>
-                <w:rFonts w:ascii="Times New Roman" w:hAnsi="Times New Roman" w:cs="Times New Roman"/>
-              </w:rPr>
-              <w:t>owner</w:t>
-            </w:r>
-            <w:proofErr w:type="gramEnd"/>
-            <w:r>
-              <w:rPr>
-                <w:rFonts w:ascii="Times New Roman" w:hAnsi="Times New Roman" w:cs="Times New Roman"/>
-              </w:rPr>
-              <w:t xml:space="preserve"> </w:t>
-            </w:r>
-            <w:proofErr w:type="gramStart"/>
-            <w:r>
-              <w:rPr>
-                <w:rFonts w:ascii="Times New Roman" w:hAnsi="Times New Roman" w:cs="Times New Roman"/>
-              </w:rPr>
-              <w:t>shall</w:t>
-            </w:r>
-            <w:proofErr w:type="gramEnd"/>
-            <w:r>
-              <w:rPr>
-                <w:rFonts w:ascii="Times New Roman" w:hAnsi="Times New Roman" w:cs="Times New Roman"/>
-              </w:rPr>
-              <w:t xml:space="preserve"> be able to create and edit their business profile</w:t>
+              <w:t>Hotel owner shall be able to create and edit their business profile</w:t>
             </w:r>
           </w:p>
         </w:tc>
@@ -6285,21 +5863,7 @@
               <w:rPr>
                 <w:rFonts w:ascii="Times New Roman" w:hAnsi="Times New Roman" w:cs="Times New Roman"/>
               </w:rPr>
-              <w:t xml:space="preserve">Hotel </w:t>
-            </w:r>
-            <w:proofErr w:type="gramStart"/>
-            <w:r>
-              <w:rPr>
-                <w:rFonts w:ascii="Times New Roman" w:hAnsi="Times New Roman" w:cs="Times New Roman"/>
-              </w:rPr>
-              <w:t>owner</w:t>
-            </w:r>
-            <w:proofErr w:type="gramEnd"/>
-            <w:r>
-              <w:rPr>
-                <w:rFonts w:ascii="Times New Roman" w:hAnsi="Times New Roman" w:cs="Times New Roman"/>
-              </w:rPr>
-              <w:t xml:space="preserve"> shall be able to manage(add/update/delete) their listings</w:t>
+              <w:t>Hotel owner shall be able to manage(add/update/delete) their listings</w:t>
             </w:r>
           </w:p>
         </w:tc>
@@ -6348,21 +5912,7 @@
               <w:rPr>
                 <w:rFonts w:ascii="Times New Roman" w:hAnsi="Times New Roman" w:cs="Times New Roman"/>
               </w:rPr>
-              <w:t xml:space="preserve">Hotel </w:t>
-            </w:r>
-            <w:proofErr w:type="gramStart"/>
-            <w:r>
-              <w:rPr>
-                <w:rFonts w:ascii="Times New Roman" w:hAnsi="Times New Roman" w:cs="Times New Roman"/>
-              </w:rPr>
-              <w:t>owner</w:t>
-            </w:r>
-            <w:proofErr w:type="gramEnd"/>
-            <w:r>
-              <w:rPr>
-                <w:rFonts w:ascii="Times New Roman" w:hAnsi="Times New Roman" w:cs="Times New Roman"/>
-              </w:rPr>
-              <w:t xml:space="preserve"> shall be able to set </w:t>
+              <w:t xml:space="preserve">Hotel owner shall be able to set </w:t>
             </w:r>
             <w:r>
               <w:rPr>
@@ -6411,35 +5961,7 @@
               <w:rPr>
                 <w:rFonts w:ascii="Times New Roman" w:hAnsi="Times New Roman" w:cs="Times New Roman"/>
               </w:rPr>
-              <w:t xml:space="preserve">Hotel </w:t>
-            </w:r>
-            <w:proofErr w:type="gramStart"/>
-            <w:r>
-              <w:rPr>
-                <w:rFonts w:ascii="Times New Roman" w:hAnsi="Times New Roman" w:cs="Times New Roman"/>
-              </w:rPr>
-              <w:t>owner</w:t>
-            </w:r>
-            <w:proofErr w:type="gramEnd"/>
-            <w:r>
-              <w:rPr>
-                <w:rFonts w:ascii="Times New Roman" w:hAnsi="Times New Roman" w:cs="Times New Roman"/>
-              </w:rPr>
-              <w:t xml:space="preserve"> </w:t>
-            </w:r>
-            <w:proofErr w:type="gramStart"/>
-            <w:r>
-              <w:rPr>
-                <w:rFonts w:ascii="Times New Roman" w:hAnsi="Times New Roman" w:cs="Times New Roman"/>
-              </w:rPr>
-              <w:t>shall</w:t>
-            </w:r>
-            <w:proofErr w:type="gramEnd"/>
-            <w:r>
-              <w:rPr>
-                <w:rFonts w:ascii="Times New Roman" w:hAnsi="Times New Roman" w:cs="Times New Roman"/>
-              </w:rPr>
-              <w:t xml:space="preserve"> be able to view manage bookings</w:t>
+              <w:t>Hotel owner shall be able to view manage bookings</w:t>
             </w:r>
           </w:p>
         </w:tc>
@@ -6494,41 +6016,13 @@
               <w:rPr>
                 <w:rFonts w:ascii="Times New Roman" w:hAnsi="Times New Roman" w:cs="Times New Roman"/>
               </w:rPr>
-              <w:t xml:space="preserve">Hotel </w:t>
-            </w:r>
-            <w:proofErr w:type="gramStart"/>
-            <w:r>
-              <w:rPr>
-                <w:rFonts w:ascii="Times New Roman" w:hAnsi="Times New Roman" w:cs="Times New Roman"/>
-              </w:rPr>
-              <w:t>owner</w:t>
-            </w:r>
-            <w:proofErr w:type="gramEnd"/>
-            <w:r>
-              <w:rPr>
-                <w:rFonts w:ascii="Times New Roman" w:hAnsi="Times New Roman" w:cs="Times New Roman"/>
-              </w:rPr>
-              <w:t xml:space="preserve"> shall be able to </w:t>
-            </w:r>
-            <w:r>
-              <w:rPr>
-                <w:rFonts w:ascii="Times New Roman" w:hAnsi="Times New Roman" w:cs="Times New Roman"/>
-              </w:rPr>
-              <w:t xml:space="preserve">view their monthly </w:t>
-            </w:r>
-            <w:proofErr w:type="gramStart"/>
-            <w:r>
-              <w:rPr>
-                <w:rFonts w:ascii="Times New Roman" w:hAnsi="Times New Roman" w:cs="Times New Roman"/>
-              </w:rPr>
-              <w:t>earning</w:t>
-            </w:r>
-            <w:proofErr w:type="gramEnd"/>
-            <w:r>
-              <w:rPr>
-                <w:rFonts w:ascii="Times New Roman" w:hAnsi="Times New Roman" w:cs="Times New Roman"/>
-              </w:rPr>
-              <w:t xml:space="preserve"> and commissions</w:t>
+              <w:t xml:space="preserve">Hotel owner shall be able to </w:t>
+            </w:r>
+            <w:r>
+              <w:rPr>
+                <w:rFonts w:ascii="Times New Roman" w:hAnsi="Times New Roman" w:cs="Times New Roman"/>
+              </w:rPr>
+              <w:t>view their monthly earning and commissions</w:t>
             </w:r>
           </w:p>
         </w:tc>
@@ -6638,21 +6132,7 @@
               <w:rPr>
                 <w:rFonts w:ascii="Times New Roman" w:hAnsi="Times New Roman" w:cs="Times New Roman"/>
               </w:rPr>
-              <w:t xml:space="preserve">Hotel </w:t>
-            </w:r>
-            <w:proofErr w:type="gramStart"/>
-            <w:r>
-              <w:rPr>
-                <w:rFonts w:ascii="Times New Roman" w:hAnsi="Times New Roman" w:cs="Times New Roman"/>
-              </w:rPr>
-              <w:t>owner</w:t>
-            </w:r>
-            <w:proofErr w:type="gramEnd"/>
-            <w:r>
-              <w:rPr>
-                <w:rFonts w:ascii="Times New Roman" w:hAnsi="Times New Roman" w:cs="Times New Roman"/>
-              </w:rPr>
-              <w:t xml:space="preserve"> shall be able to see their reviews</w:t>
+              <w:t>Hotel owner shall be able to see their reviews</w:t>
             </w:r>
           </w:p>
         </w:tc>
@@ -6902,21 +6382,7 @@
               <w:rPr>
                 <w:rFonts w:ascii="Times New Roman" w:hAnsi="Times New Roman" w:cs="Times New Roman"/>
               </w:rPr>
-              <w:t xml:space="preserve">Experience </w:t>
-            </w:r>
-            <w:proofErr w:type="gramStart"/>
-            <w:r>
-              <w:rPr>
-                <w:rFonts w:ascii="Times New Roman" w:hAnsi="Times New Roman" w:cs="Times New Roman"/>
-              </w:rPr>
-              <w:t>provider</w:t>
-            </w:r>
-            <w:proofErr w:type="gramEnd"/>
-            <w:r>
-              <w:rPr>
-                <w:rFonts w:ascii="Times New Roman" w:hAnsi="Times New Roman" w:cs="Times New Roman"/>
-              </w:rPr>
-              <w:t xml:space="preserve"> shall be able to reset their password</w:t>
+              <w:t>Experience provider shall be able to reset their password</w:t>
             </w:r>
           </w:p>
         </w:tc>
@@ -6965,21 +6431,7 @@
               <w:rPr>
                 <w:rFonts w:ascii="Times New Roman" w:hAnsi="Times New Roman" w:cs="Times New Roman"/>
               </w:rPr>
-              <w:t xml:space="preserve">Experience </w:t>
-            </w:r>
-            <w:proofErr w:type="gramStart"/>
-            <w:r>
-              <w:rPr>
-                <w:rFonts w:ascii="Times New Roman" w:hAnsi="Times New Roman" w:cs="Times New Roman"/>
-              </w:rPr>
-              <w:t>provider</w:t>
-            </w:r>
-            <w:proofErr w:type="gramEnd"/>
-            <w:r>
-              <w:rPr>
-                <w:rFonts w:ascii="Times New Roman" w:hAnsi="Times New Roman" w:cs="Times New Roman"/>
-              </w:rPr>
-              <w:t xml:space="preserve"> </w:t>
+              <w:t xml:space="preserve">Experience provider </w:t>
             </w:r>
             <w:r>
               <w:rPr>
@@ -7089,21 +6541,7 @@
               <w:rPr>
                 <w:rFonts w:ascii="Times New Roman" w:hAnsi="Times New Roman" w:cs="Times New Roman"/>
               </w:rPr>
-              <w:t xml:space="preserve">Experience </w:t>
-            </w:r>
-            <w:proofErr w:type="gramStart"/>
-            <w:r>
-              <w:rPr>
-                <w:rFonts w:ascii="Times New Roman" w:hAnsi="Times New Roman" w:cs="Times New Roman"/>
-              </w:rPr>
-              <w:t>provider</w:t>
-            </w:r>
-            <w:proofErr w:type="gramEnd"/>
-            <w:r>
-              <w:rPr>
-                <w:rFonts w:ascii="Times New Roman" w:hAnsi="Times New Roman" w:cs="Times New Roman"/>
-              </w:rPr>
-              <w:t xml:space="preserve"> </w:t>
+              <w:t xml:space="preserve">Experience provider </w:t>
             </w:r>
             <w:r>
               <w:rPr>
@@ -7329,21 +6767,7 @@
               <w:rPr>
                 <w:rFonts w:ascii="Times New Roman" w:hAnsi="Times New Roman" w:cs="Times New Roman"/>
               </w:rPr>
-              <w:t xml:space="preserve">Experience </w:t>
-            </w:r>
-            <w:proofErr w:type="gramStart"/>
-            <w:r>
-              <w:rPr>
-                <w:rFonts w:ascii="Times New Roman" w:hAnsi="Times New Roman" w:cs="Times New Roman"/>
-              </w:rPr>
-              <w:t>provider</w:t>
-            </w:r>
-            <w:proofErr w:type="gramEnd"/>
-            <w:r>
-              <w:rPr>
-                <w:rFonts w:ascii="Times New Roman" w:hAnsi="Times New Roman" w:cs="Times New Roman"/>
-              </w:rPr>
-              <w:t xml:space="preserve"> </w:t>
+              <w:t xml:space="preserve">Experience provider </w:t>
             </w:r>
             <w:r>
               <w:rPr>
@@ -7483,19 +6907,11 @@
                 <w:rFonts w:ascii="Times New Roman" w:hAnsi="Times New Roman" w:cs="Times New Roman"/>
               </w:rPr>
             </w:pPr>
-            <w:proofErr w:type="gramStart"/>
-            <w:r>
-              <w:rPr>
-                <w:rFonts w:ascii="Times New Roman" w:hAnsi="Times New Roman" w:cs="Times New Roman"/>
-              </w:rPr>
-              <w:t>Tourist</w:t>
-            </w:r>
-            <w:proofErr w:type="gramEnd"/>
-            <w:r>
-              <w:rPr>
-                <w:rFonts w:ascii="Times New Roman" w:hAnsi="Times New Roman" w:cs="Times New Roman"/>
-              </w:rPr>
-              <w:t xml:space="preserve"> shall be able to register on the platform using a</w:t>
+            <w:r>
+              <w:rPr>
+                <w:rFonts w:ascii="Times New Roman" w:hAnsi="Times New Roman" w:cs="Times New Roman"/>
+              </w:rPr>
+              <w:t>Tourist shall be able to register on the platform using a</w:t>
             </w:r>
             <w:r>
               <w:rPr>
@@ -7546,19 +6962,11 @@
                 <w:rFonts w:ascii="Times New Roman" w:hAnsi="Times New Roman" w:cs="Times New Roman"/>
               </w:rPr>
             </w:pPr>
-            <w:proofErr w:type="gramStart"/>
-            <w:r>
-              <w:rPr>
-                <w:rFonts w:ascii="Times New Roman" w:hAnsi="Times New Roman" w:cs="Times New Roman"/>
-              </w:rPr>
-              <w:t>Tourist</w:t>
-            </w:r>
-            <w:proofErr w:type="gramEnd"/>
-            <w:r>
-              <w:rPr>
-                <w:rFonts w:ascii="Times New Roman" w:hAnsi="Times New Roman" w:cs="Times New Roman"/>
-              </w:rPr>
-              <w:t xml:space="preserve"> shall be able to login/logout from the system</w:t>
+            <w:r>
+              <w:rPr>
+                <w:rFonts w:ascii="Times New Roman" w:hAnsi="Times New Roman" w:cs="Times New Roman"/>
+              </w:rPr>
+              <w:t>Tourist shall be able to login/logout from the system</w:t>
             </w:r>
           </w:p>
         </w:tc>
@@ -7591,19 +6999,11 @@
                 <w:rFonts w:ascii="Times New Roman" w:hAnsi="Times New Roman" w:cs="Times New Roman"/>
               </w:rPr>
             </w:pPr>
-            <w:proofErr w:type="gramStart"/>
-            <w:r>
-              <w:rPr>
-                <w:rFonts w:ascii="Times New Roman" w:hAnsi="Times New Roman" w:cs="Times New Roman"/>
-              </w:rPr>
-              <w:t>Tourist</w:t>
-            </w:r>
-            <w:proofErr w:type="gramEnd"/>
-            <w:r>
-              <w:rPr>
-                <w:rFonts w:ascii="Times New Roman" w:hAnsi="Times New Roman" w:cs="Times New Roman"/>
-              </w:rPr>
-              <w:t xml:space="preserve"> shall be able to reset their password</w:t>
+            <w:r>
+              <w:rPr>
+                <w:rFonts w:ascii="Times New Roman" w:hAnsi="Times New Roman" w:cs="Times New Roman"/>
+              </w:rPr>
+              <w:t>Tourist shall be able to reset their password</w:t>
             </w:r>
           </w:p>
         </w:tc>
@@ -7643,19 +7043,11 @@
                 <w:rFonts w:ascii="Times New Roman" w:hAnsi="Times New Roman" w:cs="Times New Roman"/>
               </w:rPr>
             </w:pPr>
-            <w:proofErr w:type="gramStart"/>
-            <w:r>
-              <w:rPr>
-                <w:rFonts w:ascii="Times New Roman" w:hAnsi="Times New Roman" w:cs="Times New Roman"/>
-              </w:rPr>
-              <w:t>Tourist</w:t>
-            </w:r>
-            <w:proofErr w:type="gramEnd"/>
-            <w:r>
-              <w:rPr>
-                <w:rFonts w:ascii="Times New Roman" w:hAnsi="Times New Roman" w:cs="Times New Roman"/>
-              </w:rPr>
-              <w:t xml:space="preserve"> shall be able to create and edit their profile</w:t>
+            <w:r>
+              <w:rPr>
+                <w:rFonts w:ascii="Times New Roman" w:hAnsi="Times New Roman" w:cs="Times New Roman"/>
+              </w:rPr>
+              <w:t>Tourist shall be able to create edit their profile</w:t>
             </w:r>
           </w:p>
         </w:tc>
@@ -7694,19 +7086,11 @@
                 <w:rFonts w:ascii="Times New Roman" w:hAnsi="Times New Roman" w:cs="Times New Roman"/>
               </w:rPr>
             </w:pPr>
-            <w:proofErr w:type="gramStart"/>
-            <w:r>
-              <w:rPr>
-                <w:rFonts w:ascii="Times New Roman" w:hAnsi="Times New Roman" w:cs="Times New Roman"/>
-              </w:rPr>
-              <w:t>Tourist</w:t>
-            </w:r>
-            <w:proofErr w:type="gramEnd"/>
-            <w:r>
-              <w:rPr>
-                <w:rFonts w:ascii="Times New Roman" w:hAnsi="Times New Roman" w:cs="Times New Roman"/>
-              </w:rPr>
-              <w:t xml:space="preserve"> shall be able to </w:t>
+            <w:r>
+              <w:rPr>
+                <w:rFonts w:ascii="Times New Roman" w:hAnsi="Times New Roman" w:cs="Times New Roman"/>
+              </w:rPr>
+              <w:t xml:space="preserve">Tourist shall be able to </w:t>
             </w:r>
             <w:r>
               <w:rPr>
@@ -7751,28 +7135,24 @@
                 <w:rFonts w:ascii="Times New Roman" w:hAnsi="Times New Roman" w:cs="Times New Roman"/>
               </w:rPr>
             </w:pPr>
-            <w:proofErr w:type="gramStart"/>
-            <w:r>
-              <w:rPr>
-                <w:rFonts w:ascii="Times New Roman" w:hAnsi="Times New Roman" w:cs="Times New Roman"/>
-              </w:rPr>
-              <w:t>Tourist</w:t>
-            </w:r>
-            <w:proofErr w:type="gramEnd"/>
-            <w:r>
-              <w:rPr>
-                <w:rFonts w:ascii="Times New Roman" w:hAnsi="Times New Roman" w:cs="Times New Roman"/>
-              </w:rPr>
-              <w:t xml:space="preserve"> shall be able to </w:t>
-            </w:r>
-            <w:proofErr w:type="gramStart"/>
-            <w:r>
-              <w:rPr>
-                <w:rFonts w:ascii="Times New Roman" w:hAnsi="Times New Roman" w:cs="Times New Roman"/>
-              </w:rPr>
-              <w:t>search</w:t>
-            </w:r>
-            <w:proofErr w:type="gramEnd"/>
+            <w:r>
+              <w:rPr>
+                <w:rFonts w:ascii="Times New Roman" w:hAnsi="Times New Roman" w:cs="Times New Roman"/>
+              </w:rPr>
+              <w:t xml:space="preserve">Tourist shall be able to </w:t>
+            </w:r>
+            <w:r>
+              <w:rPr>
+                <w:rFonts w:ascii="Times New Roman" w:hAnsi="Times New Roman" w:cs="Times New Roman"/>
+              </w:rPr>
+              <w:t xml:space="preserve">search </w:t>
+            </w:r>
+            <w:r>
+              <w:rPr>
+                <w:rFonts w:ascii="Times New Roman" w:hAnsi="Times New Roman" w:cs="Times New Roman"/>
+              </w:rPr>
+              <w:t>tour guides,</w:t>
+            </w:r>
             <w:r>
               <w:rPr>
                 <w:rFonts w:ascii="Times New Roman" w:hAnsi="Times New Roman" w:cs="Times New Roman"/>
@@ -7783,7 +7163,7 @@
               <w:rPr>
                 <w:rFonts w:ascii="Times New Roman" w:hAnsi="Times New Roman" w:cs="Times New Roman"/>
               </w:rPr>
-              <w:t>tour guides,</w:t>
+              <w:t>experiences,</w:t>
             </w:r>
             <w:r>
               <w:rPr>
@@ -7795,7 +7175,7 @@
               <w:rPr>
                 <w:rFonts w:ascii="Times New Roman" w:hAnsi="Times New Roman" w:cs="Times New Roman"/>
               </w:rPr>
-              <w:t>experiences,</w:t>
+              <w:t>hotels &amp; villas,</w:t>
             </w:r>
             <w:r>
               <w:rPr>
@@ -7807,19 +7187,7 @@
               <w:rPr>
                 <w:rFonts w:ascii="Times New Roman" w:hAnsi="Times New Roman" w:cs="Times New Roman"/>
               </w:rPr>
-              <w:t>hotels &amp; villas,</w:t>
-            </w:r>
-            <w:r>
-              <w:rPr>
-                <w:rFonts w:ascii="Times New Roman" w:hAnsi="Times New Roman" w:cs="Times New Roman"/>
-              </w:rPr>
-              <w:t xml:space="preserve"> </w:t>
-            </w:r>
-            <w:r>
-              <w:rPr>
-                <w:rFonts w:ascii="Times New Roman" w:hAnsi="Times New Roman" w:cs="Times New Roman"/>
-              </w:rPr>
-              <w:t>and shops near the area</w:t>
+              <w:t>and shops</w:t>
             </w:r>
           </w:p>
         </w:tc>
@@ -7858,19 +7226,11 @@
                 <w:rFonts w:ascii="Times New Roman" w:hAnsi="Times New Roman" w:cs="Times New Roman"/>
               </w:rPr>
             </w:pPr>
-            <w:proofErr w:type="gramStart"/>
-            <w:r>
-              <w:rPr>
-                <w:rFonts w:ascii="Times New Roman" w:hAnsi="Times New Roman" w:cs="Times New Roman"/>
-              </w:rPr>
-              <w:t>Tourist</w:t>
-            </w:r>
-            <w:proofErr w:type="gramEnd"/>
-            <w:r>
-              <w:rPr>
-                <w:rFonts w:ascii="Times New Roman" w:hAnsi="Times New Roman" w:cs="Times New Roman"/>
-              </w:rPr>
-              <w:t xml:space="preserve"> shall be able to filter results</w:t>
+            <w:r>
+              <w:rPr>
+                <w:rFonts w:ascii="Times New Roman" w:hAnsi="Times New Roman" w:cs="Times New Roman"/>
+              </w:rPr>
+              <w:t>Tourist shall be able to filter results</w:t>
             </w:r>
           </w:p>
         </w:tc>
@@ -7909,19 +7269,11 @@
                 <w:rFonts w:ascii="Times New Roman" w:hAnsi="Times New Roman" w:cs="Times New Roman"/>
               </w:rPr>
             </w:pPr>
-            <w:proofErr w:type="gramStart"/>
-            <w:r>
-              <w:rPr>
-                <w:rFonts w:ascii="Times New Roman" w:hAnsi="Times New Roman" w:cs="Times New Roman"/>
-              </w:rPr>
-              <w:t>Tourist</w:t>
-            </w:r>
-            <w:proofErr w:type="gramEnd"/>
-            <w:r>
-              <w:rPr>
-                <w:rFonts w:ascii="Times New Roman" w:hAnsi="Times New Roman" w:cs="Times New Roman"/>
-              </w:rPr>
-              <w:t xml:space="preserve"> shall be able to view listing pages with details</w:t>
+            <w:r>
+              <w:rPr>
+                <w:rFonts w:ascii="Times New Roman" w:hAnsi="Times New Roman" w:cs="Times New Roman"/>
+              </w:rPr>
+              <w:t>Tourist shall be able to view listing pages with details</w:t>
             </w:r>
           </w:p>
         </w:tc>
@@ -7960,19 +7312,11 @@
                 <w:rFonts w:ascii="Times New Roman" w:hAnsi="Times New Roman" w:cs="Times New Roman"/>
               </w:rPr>
             </w:pPr>
-            <w:proofErr w:type="gramStart"/>
-            <w:r>
-              <w:rPr>
-                <w:rFonts w:ascii="Times New Roman" w:hAnsi="Times New Roman" w:cs="Times New Roman"/>
-              </w:rPr>
-              <w:t>Tourist</w:t>
-            </w:r>
-            <w:proofErr w:type="gramEnd"/>
-            <w:r>
-              <w:rPr>
-                <w:rFonts w:ascii="Times New Roman" w:hAnsi="Times New Roman" w:cs="Times New Roman"/>
-              </w:rPr>
-              <w:t xml:space="preserve"> shall be able to book</w:t>
+            <w:r>
+              <w:rPr>
+                <w:rFonts w:ascii="Times New Roman" w:hAnsi="Times New Roman" w:cs="Times New Roman"/>
+              </w:rPr>
+              <w:t>Tourist shall be able to book</w:t>
             </w:r>
             <w:r>
               <w:rPr>
@@ -8023,19 +7367,11 @@
                 <w:rFonts w:ascii="Times New Roman" w:hAnsi="Times New Roman" w:cs="Times New Roman"/>
               </w:rPr>
             </w:pPr>
-            <w:proofErr w:type="gramStart"/>
-            <w:r>
-              <w:rPr>
-                <w:rFonts w:ascii="Times New Roman" w:hAnsi="Times New Roman" w:cs="Times New Roman"/>
-              </w:rPr>
-              <w:t>Tourist</w:t>
-            </w:r>
-            <w:proofErr w:type="gramEnd"/>
-            <w:r>
-              <w:rPr>
-                <w:rFonts w:ascii="Times New Roman" w:hAnsi="Times New Roman" w:cs="Times New Roman"/>
-              </w:rPr>
-              <w:t xml:space="preserve"> shall be able to see the status of their booking(pending/confirmed/rejected)</w:t>
+            <w:r>
+              <w:rPr>
+                <w:rFonts w:ascii="Times New Roman" w:hAnsi="Times New Roman" w:cs="Times New Roman"/>
+              </w:rPr>
+              <w:t>Tourist shall be able to see the status of their booking(pending/confirmed/rejected)</w:t>
             </w:r>
           </w:p>
         </w:tc>
@@ -8074,19 +7410,11 @@
                 <w:rFonts w:ascii="Times New Roman" w:hAnsi="Times New Roman" w:cs="Times New Roman"/>
               </w:rPr>
             </w:pPr>
-            <w:proofErr w:type="gramStart"/>
-            <w:r>
-              <w:rPr>
-                <w:rFonts w:ascii="Times New Roman" w:hAnsi="Times New Roman" w:cs="Times New Roman"/>
-              </w:rPr>
-              <w:t>Tourist</w:t>
-            </w:r>
-            <w:proofErr w:type="gramEnd"/>
-            <w:r>
-              <w:rPr>
-                <w:rFonts w:ascii="Times New Roman" w:hAnsi="Times New Roman" w:cs="Times New Roman"/>
-              </w:rPr>
-              <w:t xml:space="preserve"> shall be able to send messages to local</w:t>
+            <w:r>
+              <w:rPr>
+                <w:rFonts w:ascii="Times New Roman" w:hAnsi="Times New Roman" w:cs="Times New Roman"/>
+              </w:rPr>
+              <w:t>Tourist shall be able to send messages to local</w:t>
             </w:r>
             <w:r>
               <w:rPr>
@@ -8180,33 +7508,17 @@
                 <w:rFonts w:ascii="Times New Roman" w:hAnsi="Times New Roman" w:cs="Times New Roman"/>
               </w:rPr>
             </w:pPr>
-            <w:proofErr w:type="gramStart"/>
-            <w:r>
-              <w:rPr>
-                <w:rFonts w:ascii="Times New Roman" w:hAnsi="Times New Roman" w:cs="Times New Roman"/>
-              </w:rPr>
-              <w:t>Tourist</w:t>
-            </w:r>
-            <w:proofErr w:type="gramEnd"/>
-            <w:r>
-              <w:rPr>
-                <w:rFonts w:ascii="Times New Roman" w:hAnsi="Times New Roman" w:cs="Times New Roman"/>
-              </w:rPr>
-              <w:t xml:space="preserve"> </w:t>
-            </w:r>
-            <w:proofErr w:type="gramStart"/>
-            <w:r>
-              <w:rPr>
-                <w:rFonts w:ascii="Times New Roman" w:hAnsi="Times New Roman" w:cs="Times New Roman"/>
-              </w:rPr>
-              <w:t>shall</w:t>
-            </w:r>
-            <w:proofErr w:type="gramEnd"/>
-            <w:r>
-              <w:rPr>
-                <w:rFonts w:ascii="Times New Roman" w:hAnsi="Times New Roman" w:cs="Times New Roman"/>
-              </w:rPr>
-              <w:t xml:space="preserve"> be able to complete the payment after booking</w:t>
+            <w:r>
+              <w:rPr>
+                <w:rFonts w:ascii="Times New Roman" w:hAnsi="Times New Roman" w:cs="Times New Roman"/>
+              </w:rPr>
+              <w:t>Tourist shall be able to complete the payment after booking</w:t>
+            </w:r>
+            <w:r>
+              <w:rPr>
+                <w:rFonts w:ascii="Times New Roman" w:hAnsi="Times New Roman" w:cs="Times New Roman"/>
+              </w:rPr>
+              <w:t xml:space="preserve"> confirmed</w:t>
             </w:r>
           </w:p>
         </w:tc>
@@ -8242,7 +7554,6 @@
           <w:u w:val="single"/>
         </w:rPr>
       </w:pPr>
-      <w:proofErr w:type="gramStart"/>
       <w:r>
         <w:rPr>
           <w:rFonts w:ascii="Times New Roman" w:hAnsi="Times New Roman" w:cs="Times New Roman"/>
@@ -8250,17 +7561,7 @@
           <w:bCs/>
           <w:u w:val="single"/>
         </w:rPr>
-        <w:t>Non Functional</w:t>
-      </w:r>
-      <w:proofErr w:type="gramEnd"/>
-      <w:r>
-        <w:rPr>
-          <w:rFonts w:ascii="Times New Roman" w:hAnsi="Times New Roman" w:cs="Times New Roman"/>
-          <w:b/>
-          <w:bCs/>
-          <w:u w:val="single"/>
-        </w:rPr>
-        <w:t xml:space="preserve"> requirements</w:t>
+        <w:t>Non Functional requirements</w:t>
       </w:r>
     </w:p>
     <w:tbl>
@@ -8365,21 +7666,7 @@
               <w:rPr>
                 <w:rFonts w:ascii="Times New Roman" w:hAnsi="Times New Roman" w:cs="Times New Roman"/>
               </w:rPr>
-              <w:t xml:space="preserve">Platform should use </w:t>
-            </w:r>
-            <w:proofErr w:type="gramStart"/>
-            <w:r>
-              <w:rPr>
-                <w:rFonts w:ascii="Times New Roman" w:hAnsi="Times New Roman" w:cs="Times New Roman"/>
-              </w:rPr>
-              <w:t>an</w:t>
-            </w:r>
-            <w:proofErr w:type="gramEnd"/>
-            <w:r>
-              <w:rPr>
-                <w:rFonts w:ascii="Times New Roman" w:hAnsi="Times New Roman" w:cs="Times New Roman"/>
-              </w:rPr>
-              <w:t xml:space="preserve"> user friendly comfortable theme</w:t>
+              <w:t>Platform should use an user friendly comfortable theme</w:t>
             </w:r>
           </w:p>
         </w:tc>
@@ -8637,21 +7924,7 @@
               <w:rPr>
                 <w:rFonts w:ascii="Times New Roman" w:hAnsi="Times New Roman" w:cs="Times New Roman"/>
               </w:rPr>
-              <w:t xml:space="preserve">Pages should </w:t>
-            </w:r>
-            <w:proofErr w:type="gramStart"/>
-            <w:r>
-              <w:rPr>
-                <w:rFonts w:ascii="Times New Roman" w:hAnsi="Times New Roman" w:cs="Times New Roman"/>
-              </w:rPr>
-              <w:t>load</w:t>
-            </w:r>
-            <w:proofErr w:type="gramEnd"/>
-            <w:r>
-              <w:rPr>
-                <w:rFonts w:ascii="Times New Roman" w:hAnsi="Times New Roman" w:cs="Times New Roman"/>
-              </w:rPr>
-              <w:t xml:space="preserve"> within 3 seconds</w:t>
+              <w:t>Pages should load within 3 seconds</w:t>
             </w:r>
           </w:p>
         </w:tc>
@@ -8684,7 +7957,6 @@
           <w:rFonts w:ascii="Times New Roman" w:hAnsi="Times New Roman" w:cs="Times New Roman"/>
           <w:u w:val="single"/>
         </w:rPr>
-        <w:lastRenderedPageBreak/>
         <w:t>Proposed Technologies</w:t>
       </w:r>
       <w:bookmarkEnd w:id="6"/>
@@ -8740,6 +8012,7 @@
           <w:rFonts w:ascii="Times New Roman" w:hAnsi="Times New Roman" w:cs="Times New Roman"/>
           <w:noProof/>
         </w:rPr>
+        <w:lastRenderedPageBreak/>
         <w:t>For the database I will be using MySql</w:t>
       </w:r>
     </w:p>

</xml_diff>

<commit_message>
added message feature to partners
</commit_message>
<xml_diff>
--- a/docsCeylonTourMateLK/proposal/CeylonTourMate.LK.docx
+++ b/docsCeylonTourMateLK/proposal/CeylonTourMate.LK.docx
@@ -3762,19 +3762,7 @@
               <w:rPr>
                 <w:rFonts w:ascii="Times New Roman" w:hAnsi="Times New Roman" w:cs="Times New Roman"/>
               </w:rPr>
-              <w:t xml:space="preserve"> and </w:t>
-            </w:r>
-            <w:r>
-              <w:rPr>
-                <w:rFonts w:ascii="Times New Roman" w:hAnsi="Times New Roman" w:cs="Times New Roman"/>
-              </w:rPr>
-              <w:t>approve/reject</w:t>
-            </w:r>
-            <w:r>
-              <w:rPr>
-                <w:rFonts w:ascii="Times New Roman" w:hAnsi="Times New Roman" w:cs="Times New Roman"/>
-              </w:rPr>
-              <w:t xml:space="preserve"> them</w:t>
+              <w:t xml:space="preserve"> and approve/reject them</w:t>
             </w:r>
           </w:p>
         </w:tc>
@@ -4870,7 +4858,13 @@
               <w:rPr>
                 <w:rFonts w:ascii="Times New Roman" w:hAnsi="Times New Roman" w:cs="Times New Roman"/>
               </w:rPr>
-              <w:t>shall be able to reply to tourist messages</w:t>
+              <w:t xml:space="preserve">shall be able to </w:t>
+            </w:r>
+            <w:r>
+              <w:rPr>
+                <w:rFonts w:ascii="Times New Roman" w:hAnsi="Times New Roman" w:cs="Times New Roman"/>
+              </w:rPr>
+              <w:t>message /reply to tourists</w:t>
             </w:r>
           </w:p>
         </w:tc>
@@ -5439,7 +5433,13 @@
               <w:rPr>
                 <w:rFonts w:ascii="Times New Roman" w:hAnsi="Times New Roman" w:cs="Times New Roman"/>
               </w:rPr>
-              <w:t xml:space="preserve"> shall be able to reply to tourist messages</w:t>
+              <w:t xml:space="preserve"> </w:t>
+            </w:r>
+            <w:r>
+              <w:rPr>
+                <w:rFonts w:ascii="Times New Roman" w:hAnsi="Times New Roman" w:cs="Times New Roman"/>
+              </w:rPr>
+              <w:t>shall be able to message /reply to tourists</w:t>
             </w:r>
           </w:p>
         </w:tc>
@@ -6077,7 +6077,13 @@
               <w:rPr>
                 <w:rFonts w:ascii="Times New Roman" w:hAnsi="Times New Roman" w:cs="Times New Roman"/>
               </w:rPr>
-              <w:t>Hotel owner shall be able to reply to tourist messages</w:t>
+              <w:t xml:space="preserve">Hotel owner </w:t>
+            </w:r>
+            <w:r>
+              <w:rPr>
+                <w:rFonts w:ascii="Times New Roman" w:hAnsi="Times New Roman" w:cs="Times New Roman"/>
+              </w:rPr>
+              <w:t>shall be able to message /reply to tourists</w:t>
             </w:r>
           </w:p>
         </w:tc>
@@ -6718,7 +6724,7 @@
               <w:rPr>
                 <w:rFonts w:ascii="Times New Roman" w:hAnsi="Times New Roman" w:cs="Times New Roman"/>
               </w:rPr>
-              <w:t>shall be able to reply to tourist messages</w:t>
+              <w:t>shall be able to message /reply to tourists</w:t>
             </w:r>
           </w:p>
         </w:tc>

</xml_diff>